<commit_message>
AI buddy scope: lock decisions + verified Nigerian crisis helplines
- Sources WHO/NHS/MedlinePlus/CDC (authoritative-only); age open + general-info;
  20 msgs/user/day; channels web+WhatsApp+USSD (USSD = curated-menu buddy)
- Verified crisis helplines (June 2026): SURPIN, MANI, She Writes Woman, 112 —
  flagged for clinician re-confirmation at go-live
- Only open item: clinician reviewer

Co-Authored-By: Claude Opus 4.8 (1M context) <noreply@anthropic.com>
</commit_message>
<xml_diff>
--- a/MobiCova-Health-AI-Buddy-Scope.docx
+++ b/MobiCova-Health-AI-Buddy-Scope.docx
@@ -55,7 +55,7 @@
         <w:t>Free AI Health Buddy — Scope</w:t>
       </w:r>
     </w:p>
-    <w:bookmarkStart w:id="17" w:name="X37e887d9d4a88d4353b8cc364bfef4d79407207"/>
+    <w:bookmarkStart w:id="19" w:name="X37e887d9d4a88d4353b8cc364bfef4d79407207"/>
     <w:p>
       <w:pPr>
         <w:pStyle w:val="BlockText"/>
@@ -949,23 +949,26 @@
         <w:t xml:space="preserve">retrieval-grounded answers with citations</w:t>
       </w:r>
       <w:r>
-        <w:t xml:space="preserve">, and a deliberate</w:t>
-      </w:r>
-      <w:r>
-        <w:t xml:space="preserve"> </w:t>
-      </w:r>
-      <w:r>
-        <w:rPr>
-          <w:b/>
-          <w:bCs/>
-        </w:rPr>
-        <w:t xml:space="preserve">source hierarchy</w:t>
-      </w:r>
-      <w:r>
-        <w:t xml:space="preserve"> </w:t>
-      </w:r>
-      <w:r>
-        <w:t xml:space="preserve">(Wikipedia is useful but not authoritative for medicine):</w:t>
+        <w:t xml:space="preserve"> </w:t>
+      </w:r>
+      <w:r>
+        <w:t xml:space="preserve">from an</w:t>
+      </w:r>
+      <w:r>
+        <w:t xml:space="preserve"> </w:t>
+      </w:r>
+      <w:r>
+        <w:rPr>
+          <w:b/>
+          <w:bCs/>
+        </w:rPr>
+        <w:t xml:space="preserve">authoritative-only</w:t>
+      </w:r>
+      <w:r>
+        <w:t xml:space="preserve"> </w:t>
+      </w:r>
+      <w:r>
+        <w:t xml:space="preserve">source set (decision locked — no Wikipedia):</w:t>
       </w:r>
     </w:p>
     <w:p>
@@ -981,7 +984,7 @@
           <w:b/>
           <w:bCs/>
         </w:rPr>
-        <w:t xml:space="preserve">Primary (authoritative):</w:t>
+        <w:t xml:space="preserve">Sources:</w:t>
       </w:r>
       <w:r>
         <w:t xml:space="preserve"> </w:t>
@@ -999,17 +1002,20 @@
         </w:numPr>
       </w:pPr>
       <w:r>
-        <w:rPr>
-          <w:b/>
-          <w:bCs/>
-        </w:rPr>
-        <w:t xml:space="preserve">Secondary (context):</w:t>
-      </w:r>
-      <w:r>
-        <w:t xml:space="preserve"> </w:t>
-      </w:r>
-      <w:r>
-        <w:t xml:space="preserve">Wikipedia medical articles (which follow medical-sourcing guidelines).</w:t>
+        <w:t xml:space="preserve">The model is instructed to</w:t>
+      </w:r>
+      <w:r>
+        <w:t xml:space="preserve"> </w:t>
+      </w:r>
+      <w:r>
+        <w:rPr>
+          <w:b/>
+          <w:bCs/>
+        </w:rPr>
+        <w:t xml:space="preserve">answer only from retrieved passages and cite them</w:t>
+      </w:r>
+      <w:r>
+        <w:t xml:space="preserve">; if unsupported, it declines and points to a clinician.</w:t>
       </w:r>
     </w:p>
     <w:p>
@@ -1021,31 +1027,6 @@
         </w:numPr>
       </w:pPr>
       <w:r>
-        <w:t xml:space="preserve">The model is instructed to</w:t>
-      </w:r>
-      <w:r>
-        <w:t xml:space="preserve"> </w:t>
-      </w:r>
-      <w:r>
-        <w:rPr>
-          <w:b/>
-          <w:bCs/>
-        </w:rPr>
-        <w:t xml:space="preserve">answer only from retrieved passages and cite them</w:t>
-      </w:r>
-      <w:r>
-        <w:t xml:space="preserve">; if unsupported, it declines and points to a clinician.</w:t>
-      </w:r>
-    </w:p>
-    <w:p>
-      <w:pPr>
-        <w:pStyle w:val="Compact"/>
-        <w:numPr>
-          <w:ilvl w:val="0"/>
-          <w:numId w:val="1004"/>
-        </w:numPr>
-      </w:pPr>
-      <w:r>
         <w:rPr>
           <w:b/>
           <w:bCs/>
@@ -1210,7 +1191,7 @@
         <w:t xml:space="preserve"> </w:t>
       </w:r>
       <w:r>
-        <w:t xml:space="preserve">(e.g. Mentally Aware Nigeria Initiative) + emergency guidance + offer a human hand-off.</w:t>
+        <w:t xml:space="preserve">(below) + emergency guidance + offer a human hand-off.</w:t>
       </w:r>
       <w:r>
         <w:t xml:space="preserve"> </w:t>
@@ -1221,6 +1202,210 @@
           <w:bCs/>
         </w:rPr>
         <w:t xml:space="preserve">Do not ship the emotional-wellbeing buddy without this.</w:t>
+      </w:r>
+    </w:p>
+    <w:p>
+      <w:pPr>
+        <w:pStyle w:val="Compact"/>
+        <w:numPr>
+          <w:ilvl w:val="1"/>
+          <w:numId w:val="1006"/>
+        </w:numPr>
+      </w:pPr>
+      <w:r>
+        <w:rPr>
+          <w:b/>
+          <w:bCs/>
+        </w:rPr>
+        <w:t xml:space="preserve">Verified helplines (June 2026 — clinician to re-confirm at go-live):</w:t>
+      </w:r>
+    </w:p>
+    <w:p>
+      <w:pPr>
+        <w:pStyle w:val="Compact"/>
+        <w:numPr>
+          <w:ilvl w:val="2"/>
+          <w:numId w:val="1007"/>
+        </w:numPr>
+      </w:pPr>
+      <w:r>
+        <w:rPr>
+          <w:b/>
+          <w:bCs/>
+        </w:rPr>
+        <w:t xml:space="preserve">SURPIN</w:t>
+      </w:r>
+      <w:r>
+        <w:t xml:space="preserve"> </w:t>
+      </w:r>
+      <w:r>
+        <w:t xml:space="preserve">(suicide-specific, 24/7):</w:t>
+      </w:r>
+      <w:r>
+        <w:t xml:space="preserve"> </w:t>
+      </w:r>
+      <w:r>
+        <w:rPr>
+          <w:b/>
+          <w:bCs/>
+        </w:rPr>
+        <w:t xml:space="preserve">0800 0787 746</w:t>
+      </w:r>
+      <w:r>
+        <w:t xml:space="preserve"> </w:t>
+      </w:r>
+      <w:r>
+        <w:t xml:space="preserve">(toll-free) · 0908 021 7555 (9mobile) · 0903 440 0009 (MTN) · 0814 224 1007 (Hausa)</w:t>
+      </w:r>
+    </w:p>
+    <w:p>
+      <w:pPr>
+        <w:pStyle w:val="Compact"/>
+        <w:numPr>
+          <w:ilvl w:val="2"/>
+          <w:numId w:val="1007"/>
+        </w:numPr>
+      </w:pPr>
+      <w:r>
+        <w:rPr>
+          <w:b/>
+          <w:bCs/>
+        </w:rPr>
+        <w:t xml:space="preserve">MANI</w:t>
+      </w:r>
+      <w:r>
+        <w:t xml:space="preserve">:</w:t>
+      </w:r>
+      <w:r>
+        <w:t xml:space="preserve"> </w:t>
+      </w:r>
+      <w:r>
+        <w:rPr>
+          <w:b/>
+          <w:bCs/>
+        </w:rPr>
+        <w:t xml:space="preserve">0809 111 6264</w:t>
+      </w:r>
+      <w:r>
+        <w:t xml:space="preserve"> </w:t>
+      </w:r>
+      <w:r>
+        <w:t xml:space="preserve">·</w:t>
+      </w:r>
+      <w:r>
+        <w:t xml:space="preserve"> </w:t>
+      </w:r>
+      <w:r>
+        <w:rPr>
+          <w:b/>
+          <w:bCs/>
+        </w:rPr>
+        <w:t xml:space="preserve">0811 168 0686</w:t>
+      </w:r>
+      <w:r>
+        <w:t xml:space="preserve"> </w:t>
+      </w:r>
+      <w:r>
+        <w:t xml:space="preserve">· WhatsApp</w:t>
+      </w:r>
+      <w:r>
+        <w:t xml:space="preserve"> </w:t>
+      </w:r>
+      <w:r>
+        <w:rPr>
+          <w:b/>
+          <w:bCs/>
+        </w:rPr>
+        <w:t xml:space="preserve">+234 806 210 6493</w:t>
+      </w:r>
+    </w:p>
+    <w:p>
+      <w:pPr>
+        <w:pStyle w:val="Compact"/>
+        <w:numPr>
+          <w:ilvl w:val="2"/>
+          <w:numId w:val="1007"/>
+        </w:numPr>
+      </w:pPr>
+      <w:r>
+        <w:rPr>
+          <w:b/>
+          <w:bCs/>
+        </w:rPr>
+        <w:t xml:space="preserve">She Writes Woman</w:t>
+      </w:r>
+      <w:r>
+        <w:t xml:space="preserve"> </w:t>
+      </w:r>
+      <w:r>
+        <w:t xml:space="preserve">(24/7 toll-free):</w:t>
+      </w:r>
+      <w:r>
+        <w:t xml:space="preserve"> </w:t>
+      </w:r>
+      <w:r>
+        <w:rPr>
+          <w:b/>
+          <w:bCs/>
+        </w:rPr>
+        <w:t xml:space="preserve">0800 800 2000</w:t>
+      </w:r>
+    </w:p>
+    <w:p>
+      <w:pPr>
+        <w:pStyle w:val="Compact"/>
+        <w:numPr>
+          <w:ilvl w:val="2"/>
+          <w:numId w:val="1007"/>
+        </w:numPr>
+      </w:pPr>
+      <w:r>
+        <w:rPr>
+          <w:b/>
+          <w:bCs/>
+        </w:rPr>
+        <w:t xml:space="preserve">Emergency: 112</w:t>
+      </w:r>
+      <w:r>
+        <w:t xml:space="preserve"> </w:t>
+      </w:r>
+      <w:r>
+        <w:t xml:space="preserve">(Lagos also</w:t>
+      </w:r>
+      <w:r>
+        <w:t xml:space="preserve"> </w:t>
+      </w:r>
+      <w:r>
+        <w:rPr>
+          <w:b/>
+          <w:bCs/>
+        </w:rPr>
+        <w:t xml:space="preserve">767</w:t>
+      </w:r>
+      <w:r>
+        <w:t xml:space="preserve">)</w:t>
+      </w:r>
+    </w:p>
+    <w:p>
+      <w:pPr>
+        <w:pStyle w:val="Compact"/>
+        <w:numPr>
+          <w:ilvl w:val="1"/>
+          <w:numId w:val="1006"/>
+        </w:numPr>
+      </w:pPr>
+      <w:r>
+        <w:rPr>
+          <w:b/>
+          <w:bCs/>
+        </w:rPr>
+        <w:t xml:space="preserve">Buddy crisis screen</w:t>
+      </w:r>
+      <w:r>
+        <w:t xml:space="preserve"> </w:t>
+      </w:r>
+      <w:r>
+        <w:t xml:space="preserve">surfaces 3 (SURPIN · MANI · 112); web adds She Writes Woman.</w:t>
       </w:r>
     </w:p>
     <w:p>
@@ -1324,23 +1509,17 @@
         <w:t xml:space="preserve"> </w:t>
       </w:r>
       <w:r>
-        <w:t xml:space="preserve">paediatrics/menstrual topics imply minors — decide an</w:t>
-      </w:r>
-      <w:r>
-        <w:t xml:space="preserve"> </w:t>
-      </w:r>
-      <w:r>
-        <w:rPr>
-          <w:b/>
-          <w:bCs/>
-        </w:rPr>
-        <w:t xml:space="preserve">age policy</w:t>
-      </w:r>
-      <w:r>
-        <w:t xml:space="preserve"> </w:t>
-      </w:r>
-      <w:r>
-        <w:t xml:space="preserve">(gate or parental framing).</w:t>
+        <w:rPr>
+          <w:b/>
+          <w:bCs/>
+        </w:rPr>
+        <w:t xml:space="preserve">open to all, general-info framing</w:t>
+      </w:r>
+      <w:r>
+        <w:t xml:space="preserve"> </w:t>
+      </w:r>
+      <w:r>
+        <w:t xml:space="preserve">(decision locked) — no hard age gate; for child/menstrual topics the buddy speaks to the parent/caregiver and tightens scope.</w:t>
       </w:r>
     </w:p>
     <w:p>
@@ -2027,7 +2206,7 @@
         <w:pStyle w:val="Compact"/>
         <w:numPr>
           <w:ilvl w:val="0"/>
-          <w:numId w:val="1006"/>
+          <w:numId w:val="1008"/>
         </w:numPr>
       </w:pPr>
       <w:r>
@@ -2075,7 +2254,7 @@
         <w:pStyle w:val="Compact"/>
         <w:numPr>
           <w:ilvl w:val="0"/>
-          <w:numId w:val="1006"/>
+          <w:numId w:val="1008"/>
         </w:numPr>
       </w:pPr>
       <w:r>
@@ -2097,7 +2276,7 @@
         <w:pStyle w:val="Compact"/>
         <w:numPr>
           <w:ilvl w:val="0"/>
-          <w:numId w:val="1006"/>
+          <w:numId w:val="1008"/>
         </w:numPr>
       </w:pPr>
       <w:r>
@@ -2161,7 +2340,7 @@
         <w:pStyle w:val="Compact"/>
         <w:numPr>
           <w:ilvl w:val="0"/>
-          <w:numId w:val="1006"/>
+          <w:numId w:val="1008"/>
         </w:numPr>
       </w:pPr>
       <w:r>
@@ -2197,7 +2376,7 @@
         <w:pStyle w:val="Compact"/>
         <w:numPr>
           <w:ilvl w:val="0"/>
-          <w:numId w:val="1006"/>
+          <w:numId w:val="1008"/>
         </w:numPr>
       </w:pPr>
       <w:r>
@@ -2222,7 +2401,7 @@
       </w:r>
     </w:p>
     <w:bookmarkEnd w:id="15"/>
-    <w:bookmarkStart w:id="16" w:name="effort-open-decisions"/>
+    <w:bookmarkStart w:id="18" w:name="decisions-locked-effort"/>
     <w:p>
       <w:pPr>
         <w:pStyle w:val="Heading2"/>
@@ -2232,177 +2411,315 @@
           <w:rFonts w:ascii="Calibri" w:hAnsi="Calibri"/>
           <w:color w:val="0A7B7B"/>
         </w:rPr>
-        <w:t xml:space="preserve">8. Effort &amp; open decisions</w:t>
-      </w:r>
-    </w:p>
-    <w:p>
-      <w:pPr>
-        <w:pStyle w:val="Compact"/>
-        <w:numPr>
-          <w:ilvl w:val="0"/>
-          <w:numId w:val="1007"/>
-        </w:numPr>
-      </w:pPr>
-      <w:r>
-        <w:rPr>
-          <w:b/>
-          <w:bCs/>
-        </w:rPr>
-        <w:t xml:space="preserve">MVP effort:</w:t>
-      </w:r>
-      <w:r>
-        <w:t xml:space="preserve"> </w:t>
-      </w:r>
-      <w:r>
-        <w:t xml:space="preserve">~2–3 weeks for the web general buddy (retrieval + persona + safety + citations + free-tier limits), building on the existing assistant.</w:t>
-      </w:r>
-    </w:p>
-    <w:p>
-      <w:pPr>
-        <w:pStyle w:val="Compact"/>
-        <w:numPr>
-          <w:ilvl w:val="0"/>
-          <w:numId w:val="1007"/>
-        </w:numPr>
-      </w:pPr>
-      <w:r>
-        <w:rPr>
-          <w:b/>
-          <w:bCs/>
-        </w:rPr>
-        <w:t xml:space="preserve">Open decisions (yours):</w:t>
-      </w:r>
-    </w:p>
-    <w:p>
-      <w:pPr>
-        <w:pStyle w:val="Compact"/>
-        <w:numPr>
-          <w:ilvl w:val="1"/>
-          <w:numId w:val="1008"/>
-        </w:numPr>
-      </w:pPr>
-      <w:r>
-        <w:rPr>
-          <w:b/>
-          <w:bCs/>
-        </w:rPr>
-        <w:t xml:space="preserve">Source list</w:t>
-      </w:r>
-      <w:r>
-        <w:t xml:space="preserve"> </w:t>
-      </w:r>
-      <w:r>
-        <w:t xml:space="preserve">— confirm the trusted set (WHO/NHS/MedlinePlus/CDC + Wikipedia as secondary)?</w:t>
-      </w:r>
-    </w:p>
-    <w:p>
-      <w:pPr>
-        <w:pStyle w:val="Compact"/>
-        <w:numPr>
-          <w:ilvl w:val="1"/>
-          <w:numId w:val="1008"/>
-        </w:numPr>
-      </w:pPr>
-      <w:r>
-        <w:rPr>
-          <w:b/>
-          <w:bCs/>
-        </w:rPr>
-        <w:t xml:space="preserve">Clinician reviewer</w:t>
-      </w:r>
-      <w:r>
-        <w:t xml:space="preserve"> </w:t>
-      </w:r>
-      <w:r>
-        <w:t xml:space="preserve">— who signs off the corpus + canned answers + crisis flow?</w:t>
-      </w:r>
-    </w:p>
-    <w:p>
-      <w:pPr>
-        <w:pStyle w:val="Compact"/>
-        <w:numPr>
-          <w:ilvl w:val="1"/>
-          <w:numId w:val="1008"/>
-        </w:numPr>
-      </w:pPr>
-      <w:r>
-        <w:rPr>
-          <w:b/>
-          <w:bCs/>
-        </w:rPr>
-        <w:t xml:space="preserve">Age policy</w:t>
-      </w:r>
-      <w:r>
-        <w:t xml:space="preserve"> </w:t>
-      </w:r>
-      <w:r>
-        <w:t xml:space="preserve">— gate under-18, or parental framing?</w:t>
-      </w:r>
-    </w:p>
-    <w:p>
-      <w:pPr>
-        <w:pStyle w:val="Compact"/>
-        <w:numPr>
-          <w:ilvl w:val="1"/>
-          <w:numId w:val="1008"/>
-        </w:numPr>
-      </w:pPr>
-      <w:r>
-        <w:rPr>
-          <w:b/>
-          <w:bCs/>
-        </w:rPr>
-        <w:t xml:space="preserve">Free-tier limits</w:t>
-      </w:r>
-      <w:r>
-        <w:t xml:space="preserve"> </w:t>
-      </w:r>
-      <w:r>
-        <w:t xml:space="preserve">— messages/user/day?</w:t>
-      </w:r>
-    </w:p>
-    <w:p>
-      <w:pPr>
-        <w:pStyle w:val="Compact"/>
-        <w:numPr>
-          <w:ilvl w:val="1"/>
-          <w:numId w:val="1008"/>
-        </w:numPr>
-      </w:pPr>
-      <w:r>
-        <w:rPr>
-          <w:b/>
-          <w:bCs/>
-        </w:rPr>
-        <w:t xml:space="preserve">Channels at launch</w:t>
-      </w:r>
-      <w:r>
-        <w:t xml:space="preserve"> </w:t>
-      </w:r>
-      <w:r>
-        <w:t xml:space="preserve">— web only, or web + WhatsApp?</w:t>
-      </w:r>
-    </w:p>
-    <w:p>
-      <w:pPr>
-        <w:pStyle w:val="Compact"/>
-        <w:numPr>
-          <w:ilvl w:val="1"/>
-          <w:numId w:val="1008"/>
-        </w:numPr>
-      </w:pPr>
-      <w:r>
-        <w:rPr>
-          <w:b/>
-          <w:bCs/>
-        </w:rPr>
-        <w:t xml:space="preserve">Crisis helplines</w:t>
-      </w:r>
-      <w:r>
-        <w:t xml:space="preserve"> </w:t>
-      </w:r>
-      <w:r>
-        <w:t xml:space="preserve">— confirm the Nigerian helpline numbers/partners to surface.</w:t>
+        <w:t xml:space="preserve">8. Decisions (locked) &amp; effort</w:t>
+      </w:r>
+    </w:p>
+    <w:tbl>
+      <w:tblPr>
+        <w:tblStyle w:val="Table"/>
+        <w:tblW w:type="pct" w:w="5000"/>
+        <w:tblLayout w:type="fixed"/>
+        <w:tblLook w:firstRow="1" w:lastRow="0" w:firstColumn="0" w:lastColumn="0" w:noHBand="0" w:noVBand="0" w:val="0020"/>
+      </w:tblPr>
+      <w:tblGrid>
+        <w:gridCol w:w="1131"/>
+        <w:gridCol w:w="3771"/>
+        <w:gridCol w:w="3017"/>
+      </w:tblGrid>
+      <w:tr>
+        <w:trPr>
+          <w:tblHeader w:val="on"/>
+        </w:trPr>
+        <w:tc>
+          <w:tcPr/>
+          <w:p>
+            <w:pPr>
+              <w:pStyle w:val="Compact"/>
+            </w:pPr>
+            <w:r>
+              <w:t xml:space="preserve">#</w:t>
+            </w:r>
+          </w:p>
+        </w:tc>
+        <w:tc>
+          <w:tcPr/>
+          <w:p>
+            <w:pPr>
+              <w:pStyle w:val="Compact"/>
+            </w:pPr>
+            <w:r>
+              <w:t xml:space="preserve">Decision</w:t>
+            </w:r>
+          </w:p>
+        </w:tc>
+        <w:tc>
+          <w:tcPr/>
+          <w:p>
+            <w:pPr>
+              <w:pStyle w:val="Compact"/>
+            </w:pPr>
+            <w:r>
+              <w:t xml:space="preserve">Locked</w:t>
+            </w:r>
+          </w:p>
+        </w:tc>
+      </w:tr>
+      <w:tr>
+        <w:tc>
+          <w:tcPr/>
+          <w:p>
+            <w:pPr>
+              <w:pStyle w:val="Compact"/>
+            </w:pPr>
+            <w:r>
+              <w:t xml:space="preserve">1</w:t>
+            </w:r>
+          </w:p>
+        </w:tc>
+        <w:tc>
+          <w:tcPr/>
+          <w:p>
+            <w:pPr>
+              <w:pStyle w:val="Compact"/>
+            </w:pPr>
+            <w:r>
+              <w:rPr>
+                <w:b/>
+                <w:bCs/>
+              </w:rPr>
+              <w:t xml:space="preserve">Sources</w:t>
+            </w:r>
+          </w:p>
+        </w:tc>
+        <w:tc>
+          <w:tcPr/>
+          <w:p>
+            <w:pPr>
+              <w:pStyle w:val="Compact"/>
+            </w:pPr>
+            <w:r>
+              <w:t xml:space="preserve">WHO · NHS · MedlinePlus · CDC (authoritative-only, no Wikipedia)</w:t>
+            </w:r>
+          </w:p>
+        </w:tc>
+      </w:tr>
+      <w:tr>
+        <w:tc>
+          <w:tcPr/>
+          <w:p>
+            <w:pPr>
+              <w:pStyle w:val="Compact"/>
+            </w:pPr>
+            <w:r>
+              <w:t xml:space="preserve">2</w:t>
+            </w:r>
+          </w:p>
+        </w:tc>
+        <w:tc>
+          <w:tcPr/>
+          <w:p>
+            <w:pPr>
+              <w:pStyle w:val="Compact"/>
+            </w:pPr>
+            <w:r>
+              <w:rPr>
+                <w:b/>
+                <w:bCs/>
+              </w:rPr>
+              <w:t xml:space="preserve">Clinician reviewer</w:t>
+            </w:r>
+          </w:p>
+        </w:tc>
+        <w:tc>
+          <w:tcPr/>
+          <w:p>
+            <w:pPr>
+              <w:pStyle w:val="Compact"/>
+            </w:pPr>
+            <w:r>
+              <w:t xml:space="preserve">⏳</w:t>
+            </w:r>
+            <w:r>
+              <w:t xml:space="preserve"> </w:t>
+            </w:r>
+            <w:r>
+              <w:rPr>
+                <w:i/>
+                <w:iCs/>
+              </w:rPr>
+              <w:t xml:space="preserve">pending — you to name (network doctor / partner HMO team); I can draft a reviewer brief + sign-off checklist</w:t>
+            </w:r>
+          </w:p>
+        </w:tc>
+      </w:tr>
+      <w:tr>
+        <w:tc>
+          <w:tcPr/>
+          <w:p>
+            <w:pPr>
+              <w:pStyle w:val="Compact"/>
+            </w:pPr>
+            <w:r>
+              <w:t xml:space="preserve">3</w:t>
+            </w:r>
+          </w:p>
+        </w:tc>
+        <w:tc>
+          <w:tcPr/>
+          <w:p>
+            <w:pPr>
+              <w:pStyle w:val="Compact"/>
+            </w:pPr>
+            <w:r>
+              <w:rPr>
+                <w:b/>
+                <w:bCs/>
+              </w:rPr>
+              <w:t xml:space="preserve">Age policy</w:t>
+            </w:r>
+          </w:p>
+        </w:tc>
+        <w:tc>
+          <w:tcPr/>
+          <w:p>
+            <w:pPr>
+              <w:pStyle w:val="Compact"/>
+            </w:pPr>
+            <w:r>
+              <w:t xml:space="preserve">Open to all, general-info framing (no hard gate)</w:t>
+            </w:r>
+          </w:p>
+        </w:tc>
+      </w:tr>
+      <w:tr>
+        <w:tc>
+          <w:tcPr/>
+          <w:p>
+            <w:pPr>
+              <w:pStyle w:val="Compact"/>
+            </w:pPr>
+            <w:r>
+              <w:t xml:space="preserve">4</w:t>
+            </w:r>
+          </w:p>
+        </w:tc>
+        <w:tc>
+          <w:tcPr/>
+          <w:p>
+            <w:pPr>
+              <w:pStyle w:val="Compact"/>
+            </w:pPr>
+            <w:r>
+              <w:rPr>
+                <w:b/>
+                <w:bCs/>
+              </w:rPr>
+              <w:t xml:space="preserve">Free-tier limit</w:t>
+            </w:r>
+          </w:p>
+        </w:tc>
+        <w:tc>
+          <w:tcPr/>
+          <w:p>
+            <w:pPr>
+              <w:pStyle w:val="Compact"/>
+            </w:pPr>
+            <w:r>
+              <w:t xml:space="preserve">20 messages / user / day</w:t>
+            </w:r>
+          </w:p>
+        </w:tc>
+      </w:tr>
+      <w:tr>
+        <w:tc>
+          <w:tcPr/>
+          <w:p>
+            <w:pPr>
+              <w:pStyle w:val="Compact"/>
+            </w:pPr>
+            <w:r>
+              <w:t xml:space="preserve">5</w:t>
+            </w:r>
+          </w:p>
+        </w:tc>
+        <w:tc>
+          <w:tcPr/>
+          <w:p>
+            <w:pPr>
+              <w:pStyle w:val="Compact"/>
+            </w:pPr>
+            <w:r>
+              <w:rPr>
+                <w:b/>
+                <w:bCs/>
+              </w:rPr>
+              <w:t xml:space="preserve">Channels</w:t>
+            </w:r>
+          </w:p>
+        </w:tc>
+        <w:tc>
+          <w:tcPr/>
+          <w:p>
+            <w:pPr>
+              <w:pStyle w:val="Compact"/>
+            </w:pPr>
+            <w:r>
+              <w:t xml:space="preserve">Web · WhatsApp (full RAG buddy) · USSD (curated-menu buddy)</w:t>
+            </w:r>
+          </w:p>
+        </w:tc>
+      </w:tr>
+      <w:tr>
+        <w:tc>
+          <w:tcPr/>
+          <w:p>
+            <w:pPr>
+              <w:pStyle w:val="Compact"/>
+            </w:pPr>
+            <w:r>
+              <w:t xml:space="preserve">6</w:t>
+            </w:r>
+          </w:p>
+        </w:tc>
+        <w:tc>
+          <w:tcPr/>
+          <w:p>
+            <w:pPr>
+              <w:pStyle w:val="Compact"/>
+            </w:pPr>
+            <w:r>
+              <w:rPr>
+                <w:b/>
+                <w:bCs/>
+              </w:rPr>
+              <w:t xml:space="preserve">Crisis helplines</w:t>
+            </w:r>
+          </w:p>
+        </w:tc>
+        <w:tc>
+          <w:tcPr/>
+          <w:p>
+            <w:pPr>
+              <w:pStyle w:val="Compact"/>
+            </w:pPr>
+            <w:r>
+              <w:t xml:space="preserve">SURPIN · MANI · She Writes Woman · 112 (verified June 2026; clinician re-confirms at go-live)</w:t>
+            </w:r>
+          </w:p>
+        </w:tc>
+      </w:tr>
+    </w:tbl>
+    <w:bookmarkStart w:id="16" w:name="ussd-design-because-of-decision-5"/>
+    <w:p>
+      <w:pPr>
+        <w:pStyle w:val="Heading3"/>
+      </w:pPr>
+      <w:r>
+        <w:rPr>
+          <w:rFonts w:ascii="Calibri" w:hAnsi="Calibri"/>
+          <w:color w:val="0A7B7B"/>
+        </w:rPr>
+        <w:t xml:space="preserve">USSD design (because of decision #5)</w:t>
       </w:r>
     </w:p>
     <w:p>
@@ -2410,7 +2727,45 @@
         <w:pStyle w:val="FirstParagraph"/>
       </w:pPr>
       <w:r>
-        <w:t xml:space="preserve">Answer these and the MVP is ready to build — starting with the</w:t>
+        <w:t xml:space="preserve">USSD can’t do open-ended chat (session-based, ~182-char screens, timeouts). On USSD the buddy is a</w:t>
+      </w:r>
+      <w:r>
+        <w:t xml:space="preserve"> </w:t>
+      </w:r>
+      <w:r>
+        <w:rPr>
+          <w:b/>
+          <w:bCs/>
+        </w:rPr>
+        <w:t xml:space="preserve">guided menu of curated, grounded short tips + escalation</w:t>
+      </w:r>
+      <w:r>
+        <w:t xml:space="preserve"> </w:t>
+      </w:r>
+      <w:r>
+        <w:t xml:space="preserve">(reusing the canned-answer library — zero model cost, fits the screen). Crisis/red-flag on USSD shows the emergency numbers immediately. Web + WhatsApp keep the full conversational buddy.</w:t>
+      </w:r>
+    </w:p>
+    <w:bookmarkEnd w:id="16"/>
+    <w:bookmarkStart w:id="17" w:name="effort"/>
+    <w:p>
+      <w:pPr>
+        <w:pStyle w:val="Heading3"/>
+      </w:pPr>
+      <w:r>
+        <w:rPr>
+          <w:rFonts w:ascii="Calibri" w:hAnsi="Calibri"/>
+          <w:color w:val="0A7B7B"/>
+        </w:rPr>
+        <w:t xml:space="preserve">Effort</w:t>
+      </w:r>
+    </w:p>
+    <w:p>
+      <w:pPr>
+        <w:pStyle w:val="FirstParagraph"/>
+      </w:pPr>
+      <w:r>
+        <w:t xml:space="preserve">~2–3 weeks for the</w:t>
       </w:r>
       <w:r>
         <w:t xml:space="preserve"> </w:t>
@@ -2423,7 +2778,10 @@
         <w:t xml:space="preserve">web general buddy</w:t>
       </w:r>
       <w:r>
-        <w:t xml:space="preserve">, validated by whatever the</w:t>
+        <w:t xml:space="preserve"> </w:t>
+      </w:r>
+      <w:r>
+        <w:t xml:space="preserve">MVP (retrieval + persona + the two safety filters + citations + 20/day limit), building on the existing assistant — then WhatsApp, then the USSD menu, then specialty buddies (by</w:t>
       </w:r>
       <w:r>
         <w:t xml:space="preserve"> </w:t>
@@ -2438,11 +2796,43 @@
         <w:t xml:space="preserve"> </w:t>
       </w:r>
       <w:r>
-        <w:t xml:space="preserve">page tells you prospects want most.</w:t>
-      </w:r>
-    </w:p>
-    <w:bookmarkEnd w:id="16"/>
+        <w:t xml:space="preserve">demand), then Safe Emotions.</w:t>
+      </w:r>
+    </w:p>
+    <w:p>
+      <w:pPr>
+        <w:pStyle w:val="BodyText"/>
+      </w:pPr>
+      <w:r>
+        <w:rPr>
+          <w:b/>
+          <w:bCs/>
+        </w:rPr>
+        <w:t xml:space="preserve">Only open item:</w:t>
+      </w:r>
+      <w:r>
+        <w:t xml:space="preserve"> </w:t>
+      </w:r>
+      <w:r>
+        <w:t xml:space="preserve">the</w:t>
+      </w:r>
+      <w:r>
+        <w:t xml:space="preserve"> </w:t>
+      </w:r>
+      <w:r>
+        <w:rPr>
+          <w:b/>
+          <w:bCs/>
+        </w:rPr>
+        <w:t xml:space="preserve">clinician reviewer (#2)</w:t>
+      </w:r>
+      <w:r>
+        <w:t xml:space="preserve">. Everything else is locked — the MVP is build-ready.</w:t>
+      </w:r>
+    </w:p>
     <w:bookmarkEnd w:id="17"/>
+    <w:bookmarkEnd w:id="18"/>
+    <w:bookmarkEnd w:id="19"/>
     <w:p>
       <w:r>
         <w:br w:type="page"/>
@@ -2853,34 +3243,7 @@
     <w:abstractNumId w:val="991"/>
   </w:num>
   <w:num w:numId="1006">
-    <w:abstractNumId w:val="99411"/>
-    <w:lvlOverride w:ilvl="0">
-      <w:startOverride w:val="1"/>
-    </w:lvlOverride>
-    <w:lvlOverride w:ilvl="1">
-      <w:startOverride w:val="1"/>
-    </w:lvlOverride>
-    <w:lvlOverride w:ilvl="2">
-      <w:startOverride w:val="1"/>
-    </w:lvlOverride>
-    <w:lvlOverride w:ilvl="3">
-      <w:startOverride w:val="1"/>
-    </w:lvlOverride>
-    <w:lvlOverride w:ilvl="4">
-      <w:startOverride w:val="1"/>
-    </w:lvlOverride>
-    <w:lvlOverride w:ilvl="5">
-      <w:startOverride w:val="1"/>
-    </w:lvlOverride>
-    <w:lvlOverride w:ilvl="6">
-      <w:startOverride w:val="1"/>
-    </w:lvlOverride>
-    <w:lvlOverride w:ilvl="7">
-      <w:startOverride w:val="1"/>
-    </w:lvlOverride>
-    <w:lvlOverride w:ilvl="8">
-      <w:startOverride w:val="1"/>
-    </w:lvlOverride>
+    <w:abstractNumId w:val="991"/>
   </w:num>
   <w:num w:numId="1007">
     <w:abstractNumId w:val="991"/>

</xml_diff>